<commit_message>
Actualizar CV descargable con la version local mas reciente.
Reemplaza el enlace a Google Docs por el archivo DOCX del portafolio.
</commit_message>
<xml_diff>
--- a/assets/cv-adrian-fredes.docx
+++ b/assets/cv-adrian-fredes.docx
@@ -133,7 +133,7 @@
             </w:r>
           </w:p>
           <w:p>
-            <w:hyperlink w:history="1" r:id="rIdhefnvbbum3oy2btl-dcdn">
+            <w:hyperlink w:history="1" r:id="rIdufctmhppvrprakwand5mq">
               <w:r>
                 <w:rPr>
                   <w:rFonts w:ascii="Georgia" w:cs="Georgia" w:eastAsia="Georgia" w:hAnsi="Georgia"/>
@@ -154,7 +154,7 @@
               </w:rPr>
               <w:t xml:space="preserve">   ·   </w:t>
             </w:r>
-            <w:hyperlink w:history="1" r:id="rIdepvfweawo8npslef0mkrg">
+            <w:hyperlink w:history="1" r:id="rIdlovkekfzoacukxf5deio9">
               <w:r>
                 <w:rPr>
                   <w:rFonts w:ascii="Georgia" w:cs="Georgia" w:eastAsia="Georgia" w:hAnsi="Georgia"/>
@@ -180,7 +180,7 @@
         <w:pBdr>
           <w:bottom w:val="single" w:color="CCCCCC" w:sz="6" w:space="1"/>
         </w:pBdr>
-        <w:spacing w:after="90"/>
+        <w:spacing w:after="60"/>
       </w:pPr>
     </w:p>
     <w:p>
@@ -188,7 +188,7 @@
         <w:pBdr>
           <w:bottom w:val="single" w:color="9A7B2E" w:sz="8" w:space="2"/>
         </w:pBdr>
-        <w:spacing w:after="65" w:before="150"/>
+        <w:spacing w:after="50" w:before="110"/>
       </w:pPr>
       <w:r>
         <w:rPr>
@@ -196,23 +196,23 @@
           <w:b/>
           <w:bCs/>
           <w:color w:val="9A7B2E"/>
-          <w:spacing w:val="20"/>
-          <w:sz w:val="19"/>
-          <w:szCs w:val="19"/>
+          <w:spacing w:val="18"/>
+          <w:sz w:val="18"/>
+          <w:szCs w:val="18"/>
         </w:rPr>
         <w:t xml:space="preserve">PERFIL PROFESIONAL</w:t>
       </w:r>
     </w:p>
     <w:p>
       <w:pPr>
-        <w:spacing w:after="80"/>
-      </w:pPr>
-      <w:r>
-        <w:rPr>
-          <w:rFonts w:ascii="Georgia" w:cs="Georgia" w:eastAsia="Georgia" w:hAnsi="Georgia"/>
-          <w:color w:val="1A1A1A"/>
-          <w:sz w:val="17"/>
-          <w:szCs w:val="17"/>
+        <w:spacing w:after="60"/>
+      </w:pPr>
+      <w:r>
+        <w:rPr>
+          <w:rFonts w:ascii="Georgia" w:cs="Georgia" w:eastAsia="Georgia" w:hAnsi="Georgia"/>
+          <w:color w:val="1A1A1A"/>
+          <w:sz w:val="16"/>
+          <w:szCs w:val="16"/>
         </w:rPr>
         <w:t xml:space="preserve">Desarrollador full-stack (Full Stack Developer) de 21 años, de Mendoza, Argentina, con formación universitaria completa en programación (UTN — tesis en desarrollo) y experiencia real construyendo sistemas de punta a punta: backend, bases de datos, frontend, autenticación y pagos integrados. Me especialicé en automatización de procesos e integración de Inteligencia Artificial (Artificial Intelligence — IA) con sistemas de negocio: conectar datos existentes (catálogos, bases de datos, planillas) con Modelos de Lenguaje (Large Language Models — LLM) para automatizar tareas operativas como generación de respuestas o presupuestos, usando n8n y arquitecturas backend propias. Esta combinación —programador full-stack + foco en IA— me permite no solo integrar una IA a un proceso, sino diseñar y mantener el sistema completo alrededor de ella: sumar reglas de negocio, mejorar la precisión de las respuestas y liberar tiempo del equipo para tareas de mayor valor.</w:t>
       </w:r>
@@ -222,7 +222,7 @@
         <w:pBdr>
           <w:bottom w:val="single" w:color="9A7B2E" w:sz="8" w:space="2"/>
         </w:pBdr>
-        <w:spacing w:after="65" w:before="150"/>
+        <w:spacing w:after="50" w:before="110"/>
       </w:pPr>
       <w:r>
         <w:rPr>
@@ -230,25 +230,25 @@
           <w:b/>
           <w:bCs/>
           <w:color w:val="9A7B2E"/>
-          <w:spacing w:val="20"/>
-          <w:sz w:val="19"/>
-          <w:szCs w:val="19"/>
+          <w:spacing w:val="18"/>
+          <w:sz w:val="18"/>
+          <w:szCs w:val="18"/>
         </w:rPr>
         <w:t xml:space="preserve">EDUCACIÓN</w:t>
       </w:r>
     </w:p>
     <w:p>
       <w:pPr>
-        <w:spacing w:after="10" w:before="70"/>
-      </w:pPr>
-      <w:r>
-        <w:rPr>
-          <w:rFonts w:ascii="Georgia" w:cs="Georgia" w:eastAsia="Georgia" w:hAnsi="Georgia"/>
-          <w:b/>
-          <w:bCs/>
-          <w:color w:val="1A1A1A"/>
-          <w:sz w:val="19"/>
-          <w:szCs w:val="19"/>
+        <w:spacing w:after="8" w:before="55"/>
+      </w:pPr>
+      <w:r>
+        <w:rPr>
+          <w:rFonts w:ascii="Georgia" w:cs="Georgia" w:eastAsia="Georgia" w:hAnsi="Georgia"/>
+          <w:b/>
+          <w:bCs/>
+          <w:color w:val="1A1A1A"/>
+          <w:sz w:val="18"/>
+          <w:szCs w:val="18"/>
         </w:rPr>
         <w:t xml:space="preserve">Tecnicatura Universitaria en Programación (TUP)</w:t>
       </w:r>
@@ -258,22 +258,22 @@
           <w:i/>
           <w:iCs/>
           <w:color w:val="555555"/>
-          <w:sz w:val="16"/>
-          <w:szCs w:val="16"/>
+          <w:sz w:val="15"/>
+          <w:szCs w:val="15"/>
         </w:rPr>
         <w:t xml:space="preserve">   2024 — 2026 · Cursada completa, tesis en desarrollo</w:t>
       </w:r>
     </w:p>
     <w:p>
       <w:pPr>
-        <w:spacing w:after="80"/>
-      </w:pPr>
-      <w:r>
-        <w:rPr>
-          <w:rFonts w:ascii="Georgia" w:cs="Georgia" w:eastAsia="Georgia" w:hAnsi="Georgia"/>
-          <w:color w:val="1A1A1A"/>
-          <w:sz w:val="17"/>
-          <w:szCs w:val="17"/>
+        <w:spacing w:after="60"/>
+      </w:pPr>
+      <w:r>
+        <w:rPr>
+          <w:rFonts w:ascii="Georgia" w:cs="Georgia" w:eastAsia="Georgia" w:hAnsi="Georgia"/>
+          <w:color w:val="1A1A1A"/>
+          <w:sz w:val="16"/>
+          <w:szCs w:val="16"/>
         </w:rPr>
         <w:t xml:space="preserve">Universidad Tecnológica Nacional (UTN), Facultad Regional Mendoza</w:t>
       </w:r>
@@ -283,7 +283,7 @@
         <w:pBdr>
           <w:bottom w:val="single" w:color="9A7B2E" w:sz="8" w:space="2"/>
         </w:pBdr>
-        <w:spacing w:after="65" w:before="150"/>
+        <w:spacing w:after="50" w:before="110"/>
       </w:pPr>
       <w:r>
         <w:rPr>
@@ -291,25 +291,25 @@
           <w:b/>
           <w:bCs/>
           <w:color w:val="9A7B2E"/>
-          <w:spacing w:val="20"/>
-          <w:sz w:val="19"/>
-          <w:szCs w:val="19"/>
+          <w:spacing w:val="18"/>
+          <w:sz w:val="18"/>
+          <w:szCs w:val="18"/>
         </w:rPr>
         <w:t xml:space="preserve">EXPERIENCIA EN PROYECTOS</w:t>
       </w:r>
     </w:p>
     <w:p>
       <w:pPr>
-        <w:spacing w:after="10" w:before="70"/>
-      </w:pPr>
-      <w:r>
-        <w:rPr>
-          <w:rFonts w:ascii="Georgia" w:cs="Georgia" w:eastAsia="Georgia" w:hAnsi="Georgia"/>
-          <w:b/>
-          <w:bCs/>
-          <w:color w:val="1A1A1A"/>
-          <w:sz w:val="19"/>
-          <w:szCs w:val="19"/>
+        <w:spacing w:after="8" w:before="55"/>
+      </w:pPr>
+      <w:r>
+        <w:rPr>
+          <w:rFonts w:ascii="Georgia" w:cs="Georgia" w:eastAsia="Georgia" w:hAnsi="Georgia"/>
+          <w:b/>
+          <w:bCs/>
+          <w:color w:val="1A1A1A"/>
+          <w:sz w:val="18"/>
+          <w:szCs w:val="18"/>
         </w:rPr>
         <w:t xml:space="preserve">Cubika — Desarrollador Full-Stack Freelance</w:t>
       </w:r>
@@ -319,8 +319,8 @@
           <w:i/>
           <w:iCs/>
           <w:color w:val="555555"/>
-          <w:sz w:val="16"/>
-          <w:szCs w:val="16"/>
+          <w:sz w:val="15"/>
+          <w:szCs w:val="15"/>
         </w:rPr>
         <w:t xml:space="preserve">   Independiente</w:t>
       </w:r>
@@ -332,14 +332,14 @@
           <w:ilvl w:val="0"/>
           <w:numId w:val="1"/>
         </w:numPr>
-        <w:spacing w:after="20"/>
-      </w:pPr>
-      <w:r>
-        <w:rPr>
-          <w:rFonts w:ascii="Georgia" w:cs="Georgia" w:eastAsia="Georgia" w:hAnsi="Georgia"/>
-          <w:color w:val="1A1A1A"/>
-          <w:sz w:val="17"/>
-          <w:szCs w:val="17"/>
+        <w:spacing w:after="15"/>
+      </w:pPr>
+      <w:r>
+        <w:rPr>
+          <w:rFonts w:ascii="Georgia" w:cs="Georgia" w:eastAsia="Georgia" w:hAnsi="Georgia"/>
+          <w:color w:val="1A1A1A"/>
+          <w:sz w:val="16"/>
+          <w:szCs w:val="16"/>
         </w:rPr>
         <w:t xml:space="preserve">Desarrollo completo de sistema web (Full Stack Development) para empresa de arquitectura y construcción: sitio público y panel de administración separado.</w:t>
       </w:r>
@@ -351,14 +351,14 @@
           <w:ilvl w:val="0"/>
           <w:numId w:val="1"/>
         </w:numPr>
-        <w:spacing w:after="20"/>
-      </w:pPr>
-      <w:r>
-        <w:rPr>
-          <w:rFonts w:ascii="Georgia" w:cs="Georgia" w:eastAsia="Georgia" w:hAnsi="Georgia"/>
-          <w:color w:val="1A1A1A"/>
-          <w:sz w:val="17"/>
-          <w:szCs w:val="17"/>
+        <w:spacing w:after="15"/>
+      </w:pPr>
+      <w:r>
+        <w:rPr>
+          <w:rFonts w:ascii="Georgia" w:cs="Georgia" w:eastAsia="Georgia" w:hAnsi="Georgia"/>
+          <w:color w:val="1A1A1A"/>
+          <w:sz w:val="16"/>
+          <w:szCs w:val="16"/>
         </w:rPr>
         <w:t xml:space="preserve">Backend con Node.js/Express y SQLite; frontend con React 19, TailwindCSS v4 y TanStack Query v5.</w:t>
       </w:r>
@@ -370,30 +370,30 @@
           <w:ilvl w:val="0"/>
           <w:numId w:val="1"/>
         </w:numPr>
-        <w:spacing w:after="20"/>
-      </w:pPr>
-      <w:r>
-        <w:rPr>
-          <w:rFonts w:ascii="Georgia" w:cs="Georgia" w:eastAsia="Georgia" w:hAnsi="Georgia"/>
-          <w:color w:val="1A1A1A"/>
-          <w:sz w:val="17"/>
-          <w:szCs w:val="17"/>
+        <w:spacing w:after="15"/>
+      </w:pPr>
+      <w:r>
+        <w:rPr>
+          <w:rFonts w:ascii="Georgia" w:cs="Georgia" w:eastAsia="Georgia" w:hAnsi="Georgia"/>
+          <w:color w:val="1A1A1A"/>
+          <w:sz w:val="16"/>
+          <w:szCs w:val="16"/>
         </w:rPr>
         <w:t xml:space="preserve">Autenticación JWT (JWT Authentication), sistema de diseño propio y optimización de imágenes (conversión a WebP).</w:t>
       </w:r>
     </w:p>
     <w:p>
       <w:pPr>
-        <w:spacing w:after="10" w:before="70"/>
-      </w:pPr>
-      <w:r>
-        <w:rPr>
-          <w:rFonts w:ascii="Georgia" w:cs="Georgia" w:eastAsia="Georgia" w:hAnsi="Georgia"/>
-          <w:b/>
-          <w:bCs/>
-          <w:color w:val="1A1A1A"/>
-          <w:sz w:val="19"/>
-          <w:szCs w:val="19"/>
+        <w:spacing w:after="8" w:before="55"/>
+      </w:pPr>
+      <w:r>
+        <w:rPr>
+          <w:rFonts w:ascii="Georgia" w:cs="Georgia" w:eastAsia="Georgia" w:hAnsi="Georgia"/>
+          <w:b/>
+          <w:bCs/>
+          <w:color w:val="1A1A1A"/>
+          <w:sz w:val="18"/>
+          <w:szCs w:val="18"/>
         </w:rPr>
         <w:t xml:space="preserve">Alto Chori — Desarrollador Backend Freelance</w:t>
       </w:r>
@@ -403,8 +403,8 @@
           <w:i/>
           <w:iCs/>
           <w:color w:val="555555"/>
-          <w:sz w:val="16"/>
-          <w:szCs w:val="16"/>
+          <w:sz w:val="15"/>
+          <w:szCs w:val="15"/>
         </w:rPr>
         <w:t xml:space="preserve">   Independiente</w:t>
       </w:r>
@@ -416,14 +416,14 @@
           <w:ilvl w:val="0"/>
           <w:numId w:val="1"/>
         </w:numPr>
-        <w:spacing w:after="20"/>
-      </w:pPr>
-      <w:r>
-        <w:rPr>
-          <w:rFonts w:ascii="Georgia" w:cs="Georgia" w:eastAsia="Georgia" w:hAnsi="Georgia"/>
-          <w:color w:val="1A1A1A"/>
-          <w:sz w:val="17"/>
-          <w:szCs w:val="17"/>
+        <w:spacing w:after="15"/>
+      </w:pPr>
+      <w:r>
+        <w:rPr>
+          <w:rFonts w:ascii="Georgia" w:cs="Georgia" w:eastAsia="Georgia" w:hAnsi="Georgia"/>
+          <w:color w:val="1A1A1A"/>
+          <w:sz w:val="16"/>
+          <w:szCs w:val="16"/>
         </w:rPr>
         <w:t xml:space="preserve">Sistema interno de gestión para negocio gastronómico, con tres roles de usuario (Admin, Cajero, Cocinero) y actualizaciones en tiempo real vía WebSocket.</w:t>
       </w:r>
@@ -435,30 +435,30 @@
           <w:ilvl w:val="0"/>
           <w:numId w:val="1"/>
         </w:numPr>
-        <w:spacing w:after="20"/>
-      </w:pPr>
-      <w:r>
-        <w:rPr>
-          <w:rFonts w:ascii="Georgia" w:cs="Georgia" w:eastAsia="Georgia" w:hAnsi="Georgia"/>
-          <w:color w:val="1A1A1A"/>
-          <w:sz w:val="17"/>
-          <w:szCs w:val="17"/>
+        <w:spacing w:after="15"/>
+      </w:pPr>
+      <w:r>
+        <w:rPr>
+          <w:rFonts w:ascii="Georgia" w:cs="Georgia" w:eastAsia="Georgia" w:hAnsi="Georgia"/>
+          <w:color w:val="1A1A1A"/>
+          <w:sz w:val="16"/>
+          <w:szCs w:val="16"/>
         </w:rPr>
         <w:t xml:space="preserve">Backend con FastAPI y PostgreSQL, frontend con React y Vite; autenticación JWT y control de permisos por rol (Role-Based Access Control — RBAC); desplegado en Vercel/Railway.</w:t>
       </w:r>
     </w:p>
     <w:p>
       <w:pPr>
-        <w:spacing w:after="10" w:before="70"/>
-      </w:pPr>
-      <w:r>
-        <w:rPr>
-          <w:rFonts w:ascii="Georgia" w:cs="Georgia" w:eastAsia="Georgia" w:hAnsi="Georgia"/>
-          <w:b/>
-          <w:bCs/>
-          <w:color w:val="1A1A1A"/>
-          <w:sz w:val="19"/>
-          <w:szCs w:val="19"/>
+        <w:spacing w:after="8" w:before="55"/>
+      </w:pPr>
+      <w:r>
+        <w:rPr>
+          <w:rFonts w:ascii="Georgia" w:cs="Georgia" w:eastAsia="Georgia" w:hAnsi="Georgia"/>
+          <w:b/>
+          <w:bCs/>
+          <w:color w:val="1A1A1A"/>
+          <w:sz w:val="18"/>
+          <w:szCs w:val="18"/>
         </w:rPr>
         <w:t xml:space="preserve">Grupo Cardozo Seguros — Desarrollador Web Freelance</w:t>
       </w:r>
@@ -468,8 +468,8 @@
           <w:i/>
           <w:iCs/>
           <w:color w:val="555555"/>
-          <w:sz w:val="16"/>
-          <w:szCs w:val="16"/>
+          <w:sz w:val="15"/>
+          <w:szCs w:val="15"/>
         </w:rPr>
         <w:t xml:space="preserve">   Independiente</w:t>
       </w:r>
@@ -481,30 +481,30 @@
           <w:ilvl w:val="0"/>
           <w:numId w:val="1"/>
         </w:numPr>
-        <w:spacing w:after="20"/>
-      </w:pPr>
-      <w:r>
-        <w:rPr>
-          <w:rFonts w:ascii="Georgia" w:cs="Georgia" w:eastAsia="Georgia" w:hAnsi="Georgia"/>
-          <w:color w:val="1A1A1A"/>
-          <w:sz w:val="17"/>
-          <w:szCs w:val="17"/>
+        <w:spacing w:after="15"/>
+      </w:pPr>
+      <w:r>
+        <w:rPr>
+          <w:rFonts w:ascii="Georgia" w:cs="Georgia" w:eastAsia="Georgia" w:hAnsi="Georgia"/>
+          <w:color w:val="1A1A1A"/>
+          <w:sz w:val="16"/>
+          <w:szCs w:val="16"/>
         </w:rPr>
         <w:t xml:space="preserve">Desarrollo de sitio web con HTML5, CSS3 y JavaScript puro para empresa de seguros.</w:t>
       </w:r>
     </w:p>
     <w:p>
       <w:pPr>
-        <w:spacing w:after="10" w:before="70"/>
-      </w:pPr>
-      <w:r>
-        <w:rPr>
-          <w:rFonts w:ascii="Georgia" w:cs="Georgia" w:eastAsia="Georgia" w:hAnsi="Georgia"/>
-          <w:b/>
-          <w:bCs/>
-          <w:color w:val="1A1A1A"/>
-          <w:sz w:val="19"/>
-          <w:szCs w:val="19"/>
+        <w:spacing w:after="8" w:before="55"/>
+      </w:pPr>
+      <w:r>
+        <w:rPr>
+          <w:rFonts w:ascii="Georgia" w:cs="Georgia" w:eastAsia="Georgia" w:hAnsi="Georgia"/>
+          <w:b/>
+          <w:bCs/>
+          <w:color w:val="1A1A1A"/>
+          <w:sz w:val="18"/>
+          <w:szCs w:val="18"/>
         </w:rPr>
         <w:t xml:space="preserve">Sistema de Gobernanza para Desarrollo con IA</w:t>
       </w:r>
@@ -514,8 +514,8 @@
           <w:i/>
           <w:iCs/>
           <w:color w:val="555555"/>
-          <w:sz w:val="16"/>
-          <w:szCs w:val="16"/>
+          <w:sz w:val="15"/>
+          <w:szCs w:val="15"/>
         </w:rPr>
         <w:t xml:space="preserve">   Proyecto propio</w:t>
       </w:r>
@@ -527,30 +527,30 @@
           <w:ilvl w:val="0"/>
           <w:numId w:val="1"/>
         </w:numPr>
-        <w:spacing w:after="20"/>
-      </w:pPr>
-      <w:r>
-        <w:rPr>
-          <w:rFonts w:ascii="Georgia" w:cs="Georgia" w:eastAsia="Georgia" w:hAnsi="Georgia"/>
-          <w:color w:val="1A1A1A"/>
-          <w:sz w:val="17"/>
-          <w:szCs w:val="17"/>
+        <w:spacing w:after="15"/>
+      </w:pPr>
+      <w:r>
+        <w:rPr>
+          <w:rFonts w:ascii="Georgia" w:cs="Georgia" w:eastAsia="Georgia" w:hAnsi="Georgia"/>
+          <w:color w:val="1A1A1A"/>
+          <w:sz w:val="16"/>
+          <w:szCs w:val="16"/>
         </w:rPr>
         <w:t xml:space="preserve">Diseño de un sistema de reglas y especificaciones para gobernar el uso de LLMs en desarrollo (desarrollo guiado por especificaciones — Specification-Driven Development, SDD; control de calidad, severidad de deuda técnica), aplicado como estándar propio en los proyectos siguientes.</w:t>
       </w:r>
     </w:p>
     <w:p>
       <w:pPr>
-        <w:spacing w:after="10" w:before="70"/>
-      </w:pPr>
-      <w:r>
-        <w:rPr>
-          <w:rFonts w:ascii="Georgia" w:cs="Georgia" w:eastAsia="Georgia" w:hAnsi="Georgia"/>
-          <w:b/>
-          <w:bCs/>
-          <w:color w:val="1A1A1A"/>
-          <w:sz w:val="19"/>
-          <w:szCs w:val="19"/>
+        <w:spacing w:after="8" w:before="55"/>
+      </w:pPr>
+      <w:r>
+        <w:rPr>
+          <w:rFonts w:ascii="Georgia" w:cs="Georgia" w:eastAsia="Georgia" w:hAnsi="Georgia"/>
+          <w:b/>
+          <w:bCs/>
+          <w:color w:val="1A1A1A"/>
+          <w:sz w:val="18"/>
+          <w:szCs w:val="18"/>
         </w:rPr>
         <w:t xml:space="preserve">FoodStore — Desarrollador Backend</w:t>
       </w:r>
@@ -560,8 +560,8 @@
           <w:i/>
           <w:iCs/>
           <w:color w:val="555555"/>
-          <w:sz w:val="16"/>
-          <w:szCs w:val="16"/>
+          <w:sz w:val="15"/>
+          <w:szCs w:val="15"/>
         </w:rPr>
         <w:t xml:space="preserve">   Proyecto académico (Programación 4, UTN) — equipo de 3</w:t>
       </w:r>
@@ -573,14 +573,14 @@
           <w:ilvl w:val="0"/>
           <w:numId w:val="1"/>
         </w:numPr>
-        <w:spacing w:after="20"/>
-      </w:pPr>
-      <w:r>
-        <w:rPr>
-          <w:rFonts w:ascii="Georgia" w:cs="Georgia" w:eastAsia="Georgia" w:hAnsi="Georgia"/>
-          <w:color w:val="1A1A1A"/>
-          <w:sz w:val="17"/>
-          <w:szCs w:val="17"/>
+        <w:spacing w:after="15"/>
+      </w:pPr>
+      <w:r>
+        <w:rPr>
+          <w:rFonts w:ascii="Georgia" w:cs="Georgia" w:eastAsia="Georgia" w:hAnsi="Georgia"/>
+          <w:color w:val="1A1A1A"/>
+          <w:sz w:val="16"/>
+          <w:szCs w:val="16"/>
         </w:rPr>
         <w:t xml:space="preserve">Backend completo de plataforma de pedidos online (e-commerce): máquina de estados, WebSocket en tiempo real, integración de pagos (Payment Gateway Integration) con MercadoPago (idempotencia y webhooks).</w:t>
       </w:r>
@@ -592,30 +592,30 @@
           <w:ilvl w:val="0"/>
           <w:numId w:val="1"/>
         </w:numPr>
-        <w:spacing w:after="20"/>
-      </w:pPr>
-      <w:r>
-        <w:rPr>
-          <w:rFonts w:ascii="Georgia" w:cs="Georgia" w:eastAsia="Georgia" w:hAnsi="Georgia"/>
-          <w:color w:val="1A1A1A"/>
-          <w:sz w:val="17"/>
-          <w:szCs w:val="17"/>
+        <w:spacing w:after="15"/>
+      </w:pPr>
+      <w:r>
+        <w:rPr>
+          <w:rFonts w:ascii="Georgia" w:cs="Georgia" w:eastAsia="Georgia" w:hAnsi="Georgia"/>
+          <w:color w:val="1A1A1A"/>
+          <w:sz w:val="16"/>
+          <w:szCs w:val="16"/>
         </w:rPr>
         <w:t xml:space="preserve">Sistema de auditoría, rate limiting y rotación de refresh tokens; arquitectura por capas (Unit of Work). Stack: Python, PostgreSQL, API REST.</w:t>
       </w:r>
     </w:p>
     <w:p>
       <w:pPr>
-        <w:spacing w:after="10" w:before="70"/>
-      </w:pPr>
-      <w:r>
-        <w:rPr>
-          <w:rFonts w:ascii="Georgia" w:cs="Georgia" w:eastAsia="Georgia" w:hAnsi="Georgia"/>
-          <w:b/>
-          <w:bCs/>
-          <w:color w:val="1A1A1A"/>
-          <w:sz w:val="19"/>
-          <w:szCs w:val="19"/>
+        <w:spacing w:after="8" w:before="55"/>
+      </w:pPr>
+      <w:r>
+        <w:rPr>
+          <w:rFonts w:ascii="Georgia" w:cs="Georgia" w:eastAsia="Georgia" w:hAnsi="Georgia"/>
+          <w:b/>
+          <w:bCs/>
+          <w:color w:val="1A1A1A"/>
+          <w:sz w:val="18"/>
+          <w:szCs w:val="18"/>
         </w:rPr>
         <w:t xml:space="preserve">Active Trace — Desarrollador Full-Stack</w:t>
       </w:r>
@@ -625,8 +625,8 @@
           <w:i/>
           <w:iCs/>
           <w:color w:val="555555"/>
-          <w:sz w:val="16"/>
-          <w:szCs w:val="16"/>
+          <w:sz w:val="15"/>
+          <w:szCs w:val="15"/>
         </w:rPr>
         <w:t xml:space="preserve">   Proyecto académico individual (UTN)</w:t>
       </w:r>
@@ -638,14 +638,14 @@
           <w:ilvl w:val="0"/>
           <w:numId w:val="1"/>
         </w:numPr>
-        <w:spacing w:after="20"/>
-      </w:pPr>
-      <w:r>
-        <w:rPr>
-          <w:rFonts w:ascii="Georgia" w:cs="Georgia" w:eastAsia="Georgia" w:hAnsi="Georgia"/>
-          <w:color w:val="1A1A1A"/>
-          <w:sz w:val="17"/>
-          <w:szCs w:val="17"/>
+        <w:spacing w:after="15"/>
+      </w:pPr>
+      <w:r>
+        <w:rPr>
+          <w:rFonts w:ascii="Georgia" w:cs="Georgia" w:eastAsia="Georgia" w:hAnsi="Georgia"/>
+          <w:color w:val="1A1A1A"/>
+          <w:sz w:val="16"/>
+          <w:szCs w:val="16"/>
         </w:rPr>
         <w:t xml:space="preserve">Sistema de gestión académica desarrollado en solitario, con backend en FastAPI y frontend en React/TypeScript.</w:t>
       </w:r>
@@ -657,14 +657,14 @@
           <w:ilvl w:val="0"/>
           <w:numId w:val="1"/>
         </w:numPr>
-        <w:spacing w:after="20"/>
-      </w:pPr>
-      <w:r>
-        <w:rPr>
-          <w:rFonts w:ascii="Georgia" w:cs="Georgia" w:eastAsia="Georgia" w:hAnsi="Georgia"/>
-          <w:color w:val="1A1A1A"/>
-          <w:sz w:val="17"/>
-          <w:szCs w:val="17"/>
+        <w:spacing w:after="15"/>
+      </w:pPr>
+      <w:r>
+        <w:rPr>
+          <w:rFonts w:ascii="Georgia" w:cs="Georgia" w:eastAsia="Georgia" w:hAnsi="Georgia"/>
+          <w:color w:val="1A1A1A"/>
+          <w:sz w:val="16"/>
+          <w:szCs w:val="16"/>
         </w:rPr>
         <w:t xml:space="preserve">Sistema de diseño propio, control de acceso por roles y cobertura de tests automatizados (Test-Driven Development — TDD) sobre reglas críticas de negocio.</w:t>
       </w:r>
@@ -674,7 +674,7 @@
         <w:pBdr>
           <w:bottom w:val="single" w:color="9A7B2E" w:sz="8" w:space="2"/>
         </w:pBdr>
-        <w:spacing w:after="65" w:before="150"/>
+        <w:spacing w:after="50" w:before="110"/>
       </w:pPr>
       <w:r>
         <w:rPr>
@@ -682,25 +682,25 @@
           <w:b/>
           <w:bCs/>
           <w:color w:val="9A7B2E"/>
-          <w:spacing w:val="20"/>
-          <w:sz w:val="19"/>
-          <w:szCs w:val="19"/>
+          <w:spacing w:val="18"/>
+          <w:sz w:val="18"/>
+          <w:szCs w:val="18"/>
         </w:rPr>
         <w:t xml:space="preserve">HABILIDADES TÉCNICAS</w:t>
       </w:r>
     </w:p>
     <w:p>
       <w:pPr>
-        <w:spacing w:after="40"/>
-      </w:pPr>
-      <w:r>
-        <w:rPr>
-          <w:rFonts w:ascii="Georgia" w:cs="Georgia" w:eastAsia="Georgia" w:hAnsi="Georgia"/>
-          <w:b/>
-          <w:bCs/>
-          <w:color w:val="1A1A1A"/>
-          <w:sz w:val="17"/>
-          <w:szCs w:val="17"/>
+        <w:spacing w:after="30"/>
+      </w:pPr>
+      <w:r>
+        <w:rPr>
+          <w:rFonts w:ascii="Georgia" w:cs="Georgia" w:eastAsia="Georgia" w:hAnsi="Georgia"/>
+          <w:b/>
+          <w:bCs/>
+          <w:color w:val="1A1A1A"/>
+          <w:sz w:val="16"/>
+          <w:szCs w:val="16"/>
         </w:rPr>
         <w:t xml:space="preserve">Herramientas IA: </w:t>
       </w:r>
@@ -708,24 +708,24 @@
         <w:rPr>
           <w:rFonts w:ascii="Georgia" w:cs="Georgia" w:eastAsia="Georgia" w:hAnsi="Georgia"/>
           <w:color w:val="555555"/>
-          <w:sz w:val="17"/>
-          <w:szCs w:val="17"/>
+          <w:sz w:val="16"/>
+          <w:szCs w:val="16"/>
         </w:rPr>
         <w:t xml:space="preserve">LLMs (Large Language Models), MCP (Model Context Protocol), Desarrollo guiado por especificaciones (Specification-Driven Development — SDD), Cursor, ChatGPT, Claude, Ollama, Gemini CLI</w:t>
       </w:r>
     </w:p>
     <w:p>
       <w:pPr>
-        <w:spacing w:after="40"/>
-      </w:pPr>
-      <w:r>
-        <w:rPr>
-          <w:rFonts w:ascii="Georgia" w:cs="Georgia" w:eastAsia="Georgia" w:hAnsi="Georgia"/>
-          <w:b/>
-          <w:bCs/>
-          <w:color w:val="1A1A1A"/>
-          <w:sz w:val="17"/>
-          <w:szCs w:val="17"/>
+        <w:spacing w:after="30"/>
+      </w:pPr>
+      <w:r>
+        <w:rPr>
+          <w:rFonts w:ascii="Georgia" w:cs="Georgia" w:eastAsia="Georgia" w:hAnsi="Georgia"/>
+          <w:b/>
+          <w:bCs/>
+          <w:color w:val="1A1A1A"/>
+          <w:sz w:val="16"/>
+          <w:szCs w:val="16"/>
         </w:rPr>
         <w:t xml:space="preserve">Automatización: </w:t>
       </w:r>
@@ -733,24 +733,24 @@
         <w:rPr>
           <w:rFonts w:ascii="Georgia" w:cs="Georgia" w:eastAsia="Georgia" w:hAnsi="Georgia"/>
           <w:color w:val="555555"/>
-          <w:sz w:val="17"/>
-          <w:szCs w:val="17"/>
+          <w:sz w:val="16"/>
+          <w:szCs w:val="16"/>
         </w:rPr>
         <w:t xml:space="preserve">n8n</w:t>
       </w:r>
     </w:p>
     <w:p>
       <w:pPr>
-        <w:spacing w:after="40"/>
-      </w:pPr>
-      <w:r>
-        <w:rPr>
-          <w:rFonts w:ascii="Georgia" w:cs="Georgia" w:eastAsia="Georgia" w:hAnsi="Georgia"/>
-          <w:b/>
-          <w:bCs/>
-          <w:color w:val="1A1A1A"/>
-          <w:sz w:val="17"/>
-          <w:szCs w:val="17"/>
+        <w:spacing w:after="30"/>
+      </w:pPr>
+      <w:r>
+        <w:rPr>
+          <w:rFonts w:ascii="Georgia" w:cs="Georgia" w:eastAsia="Georgia" w:hAnsi="Georgia"/>
+          <w:b/>
+          <w:bCs/>
+          <w:color w:val="1A1A1A"/>
+          <w:sz w:val="16"/>
+          <w:szCs w:val="16"/>
         </w:rPr>
         <w:t xml:space="preserve">Backend &amp; Core: </w:t>
       </w:r>
@@ -758,24 +758,24 @@
         <w:rPr>
           <w:rFonts w:ascii="Georgia" w:cs="Georgia" w:eastAsia="Georgia" w:hAnsi="Georgia"/>
           <w:color w:val="555555"/>
-          <w:sz w:val="17"/>
-          <w:szCs w:val="17"/>
+          <w:sz w:val="16"/>
+          <w:szCs w:val="16"/>
         </w:rPr>
         <w:t xml:space="preserve">Node.js, Python, Java, Spring Boot, PostgreSQL, MongoDB, Docker, API REST</w:t>
       </w:r>
     </w:p>
     <w:p>
       <w:pPr>
-        <w:spacing w:after="40"/>
-      </w:pPr>
-      <w:r>
-        <w:rPr>
-          <w:rFonts w:ascii="Georgia" w:cs="Georgia" w:eastAsia="Georgia" w:hAnsi="Georgia"/>
-          <w:b/>
-          <w:bCs/>
-          <w:color w:val="1A1A1A"/>
-          <w:sz w:val="17"/>
-          <w:szCs w:val="17"/>
+        <w:spacing w:after="30"/>
+      </w:pPr>
+      <w:r>
+        <w:rPr>
+          <w:rFonts w:ascii="Georgia" w:cs="Georgia" w:eastAsia="Georgia" w:hAnsi="Georgia"/>
+          <w:b/>
+          <w:bCs/>
+          <w:color w:val="1A1A1A"/>
+          <w:sz w:val="16"/>
+          <w:szCs w:val="16"/>
         </w:rPr>
         <w:t xml:space="preserve">Frontend &amp; Web: </w:t>
       </w:r>
@@ -783,24 +783,24 @@
         <w:rPr>
           <w:rFonts w:ascii="Georgia" w:cs="Georgia" w:eastAsia="Georgia" w:hAnsi="Georgia"/>
           <w:color w:val="555555"/>
-          <w:sz w:val="17"/>
-          <w:szCs w:val="17"/>
+          <w:sz w:val="16"/>
+          <w:szCs w:val="16"/>
         </w:rPr>
         <w:t xml:space="preserve">React, Next.js, Vite, Astro, JavaScript, TypeScript, HTML5, CSS3</w:t>
       </w:r>
     </w:p>
     <w:p>
       <w:pPr>
-        <w:spacing w:after="40"/>
-      </w:pPr>
-      <w:r>
-        <w:rPr>
-          <w:rFonts w:ascii="Georgia" w:cs="Georgia" w:eastAsia="Georgia" w:hAnsi="Georgia"/>
-          <w:b/>
-          <w:bCs/>
-          <w:color w:val="1A1A1A"/>
-          <w:sz w:val="17"/>
-          <w:szCs w:val="17"/>
+        <w:spacing w:after="30"/>
+      </w:pPr>
+      <w:r>
+        <w:rPr>
+          <w:rFonts w:ascii="Georgia" w:cs="Georgia" w:eastAsia="Georgia" w:hAnsi="Georgia"/>
+          <w:b/>
+          <w:bCs/>
+          <w:color w:val="1A1A1A"/>
+          <w:sz w:val="16"/>
+          <w:szCs w:val="16"/>
         </w:rPr>
         <w:t xml:space="preserve">Infraestructura: </w:t>
       </w:r>
@@ -808,24 +808,24 @@
         <w:rPr>
           <w:rFonts w:ascii="Georgia" w:cs="Georgia" w:eastAsia="Georgia" w:hAnsi="Georgia"/>
           <w:color w:val="555555"/>
-          <w:sz w:val="17"/>
-          <w:szCs w:val="17"/>
+          <w:sz w:val="16"/>
+          <w:szCs w:val="16"/>
         </w:rPr>
         <w:t xml:space="preserve">Git, GitHub, DBeaver, Postman</w:t>
       </w:r>
     </w:p>
     <w:p>
       <w:pPr>
-        <w:spacing w:after="40"/>
-      </w:pPr>
-      <w:r>
-        <w:rPr>
-          <w:rFonts w:ascii="Georgia" w:cs="Georgia" w:eastAsia="Georgia" w:hAnsi="Georgia"/>
-          <w:b/>
-          <w:bCs/>
-          <w:color w:val="1A1A1A"/>
-          <w:sz w:val="17"/>
-          <w:szCs w:val="17"/>
+        <w:spacing w:after="30"/>
+      </w:pPr>
+      <w:r>
+        <w:rPr>
+          <w:rFonts w:ascii="Georgia" w:cs="Georgia" w:eastAsia="Georgia" w:hAnsi="Georgia"/>
+          <w:b/>
+          <w:bCs/>
+          <w:color w:val="1A1A1A"/>
+          <w:sz w:val="16"/>
+          <w:szCs w:val="16"/>
         </w:rPr>
         <w:t xml:space="preserve">Idiomas: </w:t>
       </w:r>
@@ -833,15 +833,15 @@
         <w:rPr>
           <w:rFonts w:ascii="Georgia" w:cs="Georgia" w:eastAsia="Georgia" w:hAnsi="Georgia"/>
           <w:color w:val="555555"/>
-          <w:sz w:val="17"/>
-          <w:szCs w:val="17"/>
+          <w:sz w:val="16"/>
+          <w:szCs w:val="16"/>
         </w:rPr>
         <w:t xml:space="preserve">Español (nativo), Inglés: Intermedio (lectura técnica)</w:t>
       </w:r>
     </w:p>
     <w:sectPr>
       <w:pgSz w:w="12240" w:h="15840" w:orient="portrait"/>
-      <w:pgMar w:top="480" w:right="900" w:bottom="480" w:left="900" w:header="708" w:footer="708" w:gutter="0"/>
+      <w:pgMar w:top="350" w:right="800" w:bottom="350" w:left="800" w:header="708" w:footer="708" w:gutter="0"/>
       <w:pgNumType/>
       <w:docGrid w:linePitch="360"/>
     </w:sectPr>

</xml_diff>